<commit_message>
update CV - soda paper
</commit_message>
<xml_diff>
--- a/assets/CV_minakwon.docx
+++ b/assets/CV_minakwon.docx
@@ -412,8 +412,20 @@
           <w:sz w:val="20"/>
           <w:szCs w:val="20"/>
         </w:rPr>
-        <w:t>- Advisor: Professor Woo-Young Ahn</w:t>
-      </w:r>
+        <w:t xml:space="preserve">- Advisor: Professor Woo-Young </w:t>
+      </w:r>
+      <w:proofErr w:type="spellStart"/>
+      <w:r>
+        <w:rPr>
+          <w:rFonts w:ascii="Calibri Light" w:hAnsi="Calibri Light" w:cs="Calibri Light"/>
+          <w:i/>
+          <w:iCs/>
+          <w:sz w:val="20"/>
+          <w:szCs w:val="20"/>
+        </w:rPr>
+        <w:t>Ahn</w:t>
+      </w:r>
+      <w:proofErr w:type="spellEnd"/>
     </w:p>
     <w:p>
       <w:pPr>
@@ -579,8 +591,20 @@
           <w:sz w:val="20"/>
           <w:szCs w:val="20"/>
         </w:rPr>
-        <w:t>- Advisor: Professor Woo-Young Ahn</w:t>
-      </w:r>
+        <w:t xml:space="preserve">- Advisor: Professor Woo-Young </w:t>
+      </w:r>
+      <w:proofErr w:type="spellStart"/>
+      <w:r>
+        <w:rPr>
+          <w:rFonts w:ascii="Calibri Light" w:hAnsi="Calibri Light" w:cs="Calibri Light"/>
+          <w:i/>
+          <w:iCs/>
+          <w:sz w:val="20"/>
+          <w:szCs w:val="20"/>
+        </w:rPr>
+        <w:t>Ahn</w:t>
+      </w:r>
+      <w:proofErr w:type="spellEnd"/>
     </w:p>
     <w:p>
       <w:pPr>
@@ -830,13 +854,23 @@
         </w:rPr>
         <w:tab/>
       </w:r>
-      <w:r>
-        <w:rPr>
-          <w:rFonts w:ascii="Calibri Light" w:hAnsi="Calibri Light" w:cs="Calibri Light"/>
-          <w:sz w:val="20"/>
-          <w:szCs w:val="20"/>
-        </w:rPr>
-        <w:t>StonyBrook, NY</w:t>
+      <w:proofErr w:type="spellStart"/>
+      <w:r>
+        <w:rPr>
+          <w:rFonts w:ascii="Calibri Light" w:hAnsi="Calibri Light" w:cs="Calibri Light"/>
+          <w:sz w:val="20"/>
+          <w:szCs w:val="20"/>
+        </w:rPr>
+        <w:t>StonyBrook</w:t>
+      </w:r>
+      <w:proofErr w:type="spellEnd"/>
+      <w:r>
+        <w:rPr>
+          <w:rFonts w:ascii="Calibri Light" w:hAnsi="Calibri Light" w:cs="Calibri Light"/>
+          <w:sz w:val="20"/>
+          <w:szCs w:val="20"/>
+        </w:rPr>
+        <w:t>, NY</w:t>
       </w:r>
     </w:p>
     <w:p>
@@ -1010,13 +1044,41 @@
         </w:rPr>
         <w:t xml:space="preserve">Lee, Y., </w:t>
       </w:r>
-      <w:r>
-        <w:rPr>
-          <w:rFonts w:ascii="Calibri Light" w:hAnsi="Calibri Light" w:cs="Calibri Light"/>
-          <w:sz w:val="22"/>
-          <w:lang w:eastAsia="ko-KR"/>
-        </w:rPr>
-        <w:t>Hur, J., Lee, T.-H., &amp; Ahn, W.-Y. (</w:t>
+      <w:proofErr w:type="spellStart"/>
+      <w:r>
+        <w:rPr>
+          <w:rFonts w:ascii="Calibri Light" w:hAnsi="Calibri Light" w:cs="Calibri Light"/>
+          <w:sz w:val="22"/>
+          <w:lang w:eastAsia="ko-KR"/>
+        </w:rPr>
+        <w:t>Hur</w:t>
+      </w:r>
+      <w:proofErr w:type="spellEnd"/>
+      <w:r>
+        <w:rPr>
+          <w:rFonts w:ascii="Calibri Light" w:hAnsi="Calibri Light" w:cs="Calibri Light"/>
+          <w:sz w:val="22"/>
+          <w:lang w:eastAsia="ko-KR"/>
+        </w:rPr>
+        <w:t xml:space="preserve">, J., Lee, T.-H., &amp; </w:t>
+      </w:r>
+      <w:proofErr w:type="spellStart"/>
+      <w:r>
+        <w:rPr>
+          <w:rFonts w:ascii="Calibri Light" w:hAnsi="Calibri Light" w:cs="Calibri Light"/>
+          <w:sz w:val="22"/>
+          <w:lang w:eastAsia="ko-KR"/>
+        </w:rPr>
+        <w:t>Ahn</w:t>
+      </w:r>
+      <w:proofErr w:type="spellEnd"/>
+      <w:r>
+        <w:rPr>
+          <w:rFonts w:ascii="Calibri Light" w:hAnsi="Calibri Light" w:cs="Calibri Light"/>
+          <w:sz w:val="22"/>
+          <w:lang w:eastAsia="ko-KR"/>
+        </w:rPr>
+        <w:t>, W.-Y. (</w:t>
       </w:r>
       <w:r>
         <w:rPr>
@@ -1040,7 +1102,55 @@
           <w:sz w:val="22"/>
           <w:lang w:eastAsia="ko-KR"/>
         </w:rPr>
-        <w:t>Daily caffeinated soda intake in children is associated with neurocognitive vulnerabilities of substance misuse and predicts higher risk of alcohol sipping in 12 months</w:t>
+        <w:t xml:space="preserve">Daily caffeinated soda intake in children is associated with neurocognitive vulnerabilities of substance misuse and </w:t>
+      </w:r>
+      <w:r>
+        <w:rPr>
+          <w:rFonts w:ascii="Calibri Light" w:hAnsi="Calibri Light" w:cs="Calibri Light"/>
+          <w:sz w:val="22"/>
+          <w:lang w:eastAsia="ko-KR"/>
+        </w:rPr>
+        <w:t xml:space="preserve">is </w:t>
+      </w:r>
+      <w:r>
+        <w:rPr>
+          <w:rFonts w:ascii="Calibri Light" w:hAnsi="Calibri Light" w:cs="Calibri Light"/>
+          <w:sz w:val="22"/>
+          <w:lang w:eastAsia="ko-KR"/>
+        </w:rPr>
+        <w:t>predic</w:t>
+      </w:r>
+      <w:r>
+        <w:rPr>
+          <w:rFonts w:ascii="Calibri Light" w:hAnsi="Calibri Light" w:cs="Calibri Light"/>
+          <w:sz w:val="22"/>
+          <w:lang w:eastAsia="ko-KR"/>
+        </w:rPr>
+        <w:t xml:space="preserve">tive of </w:t>
+      </w:r>
+      <w:r>
+        <w:rPr>
+          <w:rFonts w:ascii="Calibri Light" w:hAnsi="Calibri Light" w:cs="Calibri Light"/>
+          <w:sz w:val="22"/>
+          <w:lang w:eastAsia="ko-KR"/>
+        </w:rPr>
+        <w:t xml:space="preserve">higher risk of alcohol sipping </w:t>
+      </w:r>
+      <w:r>
+        <w:rPr>
+          <w:rFonts w:ascii="Calibri Light" w:hAnsi="Calibri Light" w:cs="Calibri Light"/>
+          <w:sz w:val="22"/>
+          <w:lang w:eastAsia="ko-KR"/>
+        </w:rPr>
+        <w:t>after</w:t>
+      </w:r>
+      <w:r>
+        <w:rPr>
+          <w:rFonts w:ascii="Calibri Light" w:hAnsi="Calibri Light" w:cs="Calibri Light"/>
+          <w:sz w:val="22"/>
+          <w:lang w:eastAsia="ko-KR"/>
+        </w:rPr>
+        <w:t xml:space="preserve"> 12 months</w:t>
       </w:r>
       <w:r>
         <w:rPr>
@@ -1058,6 +1168,7 @@
         </w:rPr>
         <w:t xml:space="preserve"> </w:t>
       </w:r>
+      <w:proofErr w:type="spellStart"/>
       <w:r>
         <w:rPr>
           <w:rFonts w:ascii="Calibri Light" w:hAnsi="Calibri Light" w:cs="Calibri Light"/>
@@ -1068,6 +1179,7 @@
         </w:rPr>
         <w:t>BioRxiv</w:t>
       </w:r>
+      <w:proofErr w:type="spellEnd"/>
       <w:r>
         <w:rPr>
           <w:rFonts w:ascii="Calibri Light" w:hAnsi="Calibri Light" w:cs="Calibri Light"/>
@@ -1099,14 +1211,6 @@
           <w:lang w:eastAsia="ko-KR"/>
         </w:rPr>
         <w:t>.</w:t>
-      </w:r>
-      <w:r>
-        <w:rPr>
-          <w:rFonts w:ascii="Calibri Light" w:hAnsi="Calibri Light" w:cs="Calibri Light"/>
-          <w:sz w:val="22"/>
-          <w:lang w:eastAsia="ko-KR"/>
-        </w:rPr>
-        <w:t xml:space="preserve"> </w:t>
       </w:r>
     </w:p>
     <w:p>
@@ -1191,13 +1295,41 @@
         </w:rPr>
         <w:t xml:space="preserve">Lee, Y., </w:t>
       </w:r>
-      <w:r>
-        <w:rPr>
-          <w:rFonts w:ascii="Calibri Light" w:hAnsi="Calibri Light" w:cs="Calibri Light"/>
-          <w:sz w:val="22"/>
-          <w:lang w:eastAsia="ko-KR"/>
-        </w:rPr>
-        <w:t>Hur, J., Lee, T., &amp; Ahn, W. (</w:t>
+      <w:proofErr w:type="spellStart"/>
+      <w:r>
+        <w:rPr>
+          <w:rFonts w:ascii="Calibri Light" w:hAnsi="Calibri Light" w:cs="Calibri Light"/>
+          <w:sz w:val="22"/>
+          <w:lang w:eastAsia="ko-KR"/>
+        </w:rPr>
+        <w:t>Hur</w:t>
+      </w:r>
+      <w:proofErr w:type="spellEnd"/>
+      <w:r>
+        <w:rPr>
+          <w:rFonts w:ascii="Calibri Light" w:hAnsi="Calibri Light" w:cs="Calibri Light"/>
+          <w:sz w:val="22"/>
+          <w:lang w:eastAsia="ko-KR"/>
+        </w:rPr>
+        <w:t xml:space="preserve">, J., Lee, T., &amp; </w:t>
+      </w:r>
+      <w:proofErr w:type="spellStart"/>
+      <w:r>
+        <w:rPr>
+          <w:rFonts w:ascii="Calibri Light" w:hAnsi="Calibri Light" w:cs="Calibri Light"/>
+          <w:sz w:val="22"/>
+          <w:lang w:eastAsia="ko-KR"/>
+        </w:rPr>
+        <w:t>Ahn</w:t>
+      </w:r>
+      <w:proofErr w:type="spellEnd"/>
+      <w:r>
+        <w:rPr>
+          <w:rFonts w:ascii="Calibri Light" w:hAnsi="Calibri Light" w:cs="Calibri Light"/>
+          <w:sz w:val="22"/>
+          <w:lang w:eastAsia="ko-KR"/>
+        </w:rPr>
+        <w:t>, W. (</w:t>
       </w:r>
       <w:r>
         <w:rPr>
@@ -1279,15 +1411,23 @@
           <w:sz w:val="22"/>
           <w:lang w:eastAsia="ko-KR"/>
         </w:rPr>
-        <w:t>DOI: 10.13140/RG.2.2.35982.23365</w:t>
-      </w:r>
-      <w:r>
-        <w:rPr>
-          <w:rFonts w:ascii="Calibri Light" w:hAnsi="Calibri Light" w:cs="Calibri Light"/>
-          <w:sz w:val="22"/>
-          <w:lang w:eastAsia="ko-KR"/>
-        </w:rPr>
-        <w:t>.</w:t>
+        <w:t xml:space="preserve">DOI: </w:t>
+      </w:r>
+      <w:r>
+        <w:rPr>
+          <w:rFonts w:ascii="Calibri Light" w:hAnsi="Calibri Light" w:cs="Calibri Light"/>
+          <w:sz w:val="22"/>
+          <w:lang w:eastAsia="ko-KR"/>
+        </w:rPr>
+        <w:t>https://doi.org/10.1016/j.biopsych.2022.02.257</w:t>
+      </w:r>
+      <w:r>
+        <w:rPr>
+          <w:rFonts w:ascii="Calibri Light" w:hAnsi="Calibri Light" w:cs="Calibri Light"/>
+          <w:sz w:val="22"/>
+          <w:lang w:eastAsia="ko-KR"/>
+        </w:rPr>
+        <w:t xml:space="preserve"> </w:t>
       </w:r>
     </w:p>
     <w:p>
@@ -1369,13 +1509,23 @@
         </w:rPr>
         <w:t xml:space="preserve">&amp; </w:t>
       </w:r>
-      <w:r>
-        <w:rPr>
-          <w:rFonts w:ascii="Calibri Light" w:hAnsi="Calibri Light" w:cs="Calibri Light"/>
-          <w:sz w:val="22"/>
-          <w:lang w:eastAsia="ko-KR"/>
-        </w:rPr>
-        <w:t>Ahn, W. (202</w:t>
+      <w:proofErr w:type="spellStart"/>
+      <w:r>
+        <w:rPr>
+          <w:rFonts w:ascii="Calibri Light" w:hAnsi="Calibri Light" w:cs="Calibri Light"/>
+          <w:sz w:val="22"/>
+          <w:lang w:eastAsia="ko-KR"/>
+        </w:rPr>
+        <w:t>Ahn</w:t>
+      </w:r>
+      <w:proofErr w:type="spellEnd"/>
+      <w:r>
+        <w:rPr>
+          <w:rFonts w:ascii="Calibri Light" w:hAnsi="Calibri Light" w:cs="Calibri Light"/>
+          <w:sz w:val="22"/>
+          <w:lang w:eastAsia="ko-KR"/>
+        </w:rPr>
+        <w:t>, W. (202</w:t>
       </w:r>
       <w:r>
         <w:rPr>
@@ -1517,7 +1667,25 @@
           <w:sz w:val="22"/>
           <w:lang w:eastAsia="ko-KR"/>
         </w:rPr>
-        <w:t xml:space="preserve">, Ahn, W., &amp; Jung, Y. (2020) Neural Correlates of Goal-Directed Control in Interest Gaming Disorder and Alcohol Use Disorder, </w:t>
+        <w:t xml:space="preserve">, </w:t>
+      </w:r>
+      <w:proofErr w:type="spellStart"/>
+      <w:r>
+        <w:rPr>
+          <w:rFonts w:ascii="Calibri Light" w:hAnsi="Calibri Light" w:cs="Calibri Light"/>
+          <w:sz w:val="22"/>
+          <w:lang w:eastAsia="ko-KR"/>
+        </w:rPr>
+        <w:t>Ahn</w:t>
+      </w:r>
+      <w:proofErr w:type="spellEnd"/>
+      <w:r>
+        <w:rPr>
+          <w:rFonts w:ascii="Calibri Light" w:hAnsi="Calibri Light" w:cs="Calibri Light"/>
+          <w:sz w:val="22"/>
+          <w:lang w:eastAsia="ko-KR"/>
+        </w:rPr>
+        <w:t xml:space="preserve">, W., &amp; Jung, Y. (2020) Neural Correlates of Goal-Directed Control in Interest Gaming Disorder and Alcohol Use Disorder, </w:t>
       </w:r>
       <w:r>
         <w:rPr>
@@ -1599,7 +1767,43 @@
           <w:sz w:val="22"/>
           <w:lang w:eastAsia="ko-KR"/>
         </w:rPr>
-        <w:t xml:space="preserve">, Kim, H., Yang, J., Hur, J., Lee, T., &amp; Ahn, W. (2019) Identifying behavioral and neural predictors of caffeinated soda intake in childhood using a large database from the ABCD study, </w:t>
+        <w:t xml:space="preserve">, Kim, H., Yang, J., </w:t>
+      </w:r>
+      <w:proofErr w:type="spellStart"/>
+      <w:r>
+        <w:rPr>
+          <w:rFonts w:ascii="Calibri Light" w:hAnsi="Calibri Light" w:cs="Calibri Light"/>
+          <w:sz w:val="22"/>
+          <w:lang w:eastAsia="ko-KR"/>
+        </w:rPr>
+        <w:t>Hur</w:t>
+      </w:r>
+      <w:proofErr w:type="spellEnd"/>
+      <w:r>
+        <w:rPr>
+          <w:rFonts w:ascii="Calibri Light" w:hAnsi="Calibri Light" w:cs="Calibri Light"/>
+          <w:sz w:val="22"/>
+          <w:lang w:eastAsia="ko-KR"/>
+        </w:rPr>
+        <w:t xml:space="preserve">, J., Lee, T., &amp; </w:t>
+      </w:r>
+      <w:proofErr w:type="spellStart"/>
+      <w:r>
+        <w:rPr>
+          <w:rFonts w:ascii="Calibri Light" w:hAnsi="Calibri Light" w:cs="Calibri Light"/>
+          <w:sz w:val="22"/>
+          <w:lang w:eastAsia="ko-KR"/>
+        </w:rPr>
+        <w:t>Ahn</w:t>
+      </w:r>
+      <w:proofErr w:type="spellEnd"/>
+      <w:r>
+        <w:rPr>
+          <w:rFonts w:ascii="Calibri Light" w:hAnsi="Calibri Light" w:cs="Calibri Light"/>
+          <w:sz w:val="22"/>
+          <w:lang w:eastAsia="ko-KR"/>
+        </w:rPr>
+        <w:t xml:space="preserve">, W. (2019) Identifying behavioral and neural predictors of caffeinated soda intake in childhood using a large database from the ABCD study, </w:t>
       </w:r>
       <w:r>
         <w:rPr>
@@ -1685,7 +1889,25 @@
           <w:sz w:val="22"/>
           <w:lang w:eastAsia="ko-KR"/>
         </w:rPr>
-        <w:t xml:space="preserve">., &amp; Ahn, W. (2019) Effects of early life stress and social resources on neurocognitive functions: A large-scale replication study, </w:t>
+        <w:t xml:space="preserve">., &amp; </w:t>
+      </w:r>
+      <w:proofErr w:type="spellStart"/>
+      <w:r>
+        <w:rPr>
+          <w:rFonts w:ascii="Calibri Light" w:hAnsi="Calibri Light" w:cs="Calibri Light"/>
+          <w:sz w:val="22"/>
+          <w:lang w:eastAsia="ko-KR"/>
+        </w:rPr>
+        <w:t>Ahn</w:t>
+      </w:r>
+      <w:proofErr w:type="spellEnd"/>
+      <w:r>
+        <w:rPr>
+          <w:rFonts w:ascii="Calibri Light" w:hAnsi="Calibri Light" w:cs="Calibri Light"/>
+          <w:sz w:val="22"/>
+          <w:lang w:eastAsia="ko-KR"/>
+        </w:rPr>
+        <w:t xml:space="preserve">, W. (2019) Effects of early life stress and social resources on neurocognitive functions: A large-scale replication study, </w:t>
       </w:r>
       <w:r>
         <w:rPr>
@@ -1853,7 +2075,29 @@
           <w:sz w:val="20"/>
           <w:szCs w:val="20"/>
         </w:rPr>
-        <w:t>Reinforcement Learning using the hBayesDM Package</w:t>
+        <w:t xml:space="preserve">Reinforcement Learning using the </w:t>
+      </w:r>
+      <w:proofErr w:type="spellStart"/>
+      <w:r>
+        <w:rPr>
+          <w:rFonts w:ascii="Calibri Light" w:hAnsi="Calibri Light" w:cs="Calibri Light"/>
+          <w:i/>
+          <w:iCs/>
+          <w:sz w:val="20"/>
+          <w:szCs w:val="20"/>
+        </w:rPr>
+        <w:t>hBayesDM</w:t>
+      </w:r>
+      <w:proofErr w:type="spellEnd"/>
+      <w:r>
+        <w:rPr>
+          <w:rFonts w:ascii="Calibri Light" w:hAnsi="Calibri Light" w:cs="Calibri Light"/>
+          <w:i/>
+          <w:iCs/>
+          <w:sz w:val="20"/>
+          <w:szCs w:val="20"/>
+        </w:rPr>
+        <w:t xml:space="preserve"> Package</w:t>
       </w:r>
       <w:r>
         <w:rPr>
@@ -2934,8 +3178,20 @@
           <w:sz w:val="20"/>
           <w:szCs w:val="20"/>
         </w:rPr>
-        <w:t>PI: Professor Woo-Young Ahn</w:t>
-      </w:r>
+        <w:t xml:space="preserve">PI: Professor Woo-Young </w:t>
+      </w:r>
+      <w:proofErr w:type="spellStart"/>
+      <w:r>
+        <w:rPr>
+          <w:rFonts w:ascii="Calibri Light" w:hAnsi="Calibri Light" w:cs="Calibri Light"/>
+          <w:i/>
+          <w:iCs/>
+          <w:sz w:val="20"/>
+          <w:szCs w:val="20"/>
+        </w:rPr>
+        <w:t>Ahn</w:t>
+      </w:r>
+      <w:proofErr w:type="spellEnd"/>
     </w:p>
     <w:p>
       <w:pPr>
@@ -3118,7 +3374,29 @@
           <w:sz w:val="20"/>
           <w:szCs w:val="20"/>
         </w:rPr>
-        <w:t>PI: Professor Jeanyoung Chey</w:t>
+        <w:t xml:space="preserve">PI: Professor </w:t>
+      </w:r>
+      <w:proofErr w:type="spellStart"/>
+      <w:r>
+        <w:rPr>
+          <w:rFonts w:ascii="Calibri Light" w:hAnsi="Calibri Light" w:cs="Calibri Light"/>
+          <w:i/>
+          <w:iCs/>
+          <w:sz w:val="20"/>
+          <w:szCs w:val="20"/>
+        </w:rPr>
+        <w:t>Jeanyoung</w:t>
+      </w:r>
+      <w:proofErr w:type="spellEnd"/>
+      <w:r>
+        <w:rPr>
+          <w:rFonts w:ascii="Calibri Light" w:hAnsi="Calibri Light" w:cs="Calibri Light"/>
+          <w:i/>
+          <w:iCs/>
+          <w:sz w:val="20"/>
+          <w:szCs w:val="20"/>
+        </w:rPr>
+        <w:t xml:space="preserve"> Chey</w:t>
       </w:r>
     </w:p>
     <w:p>
@@ -3297,7 +3575,29 @@
           <w:sz w:val="20"/>
           <w:szCs w:val="20"/>
         </w:rPr>
-        <w:t>PI: Research Professor Sungshin Kim</w:t>
+        <w:t xml:space="preserve">PI: Research Professor </w:t>
+      </w:r>
+      <w:proofErr w:type="spellStart"/>
+      <w:r>
+        <w:rPr>
+          <w:rFonts w:ascii="Calibri Light" w:hAnsi="Calibri Light" w:cs="Calibri Light"/>
+          <w:i/>
+          <w:iCs/>
+          <w:sz w:val="20"/>
+          <w:szCs w:val="20"/>
+        </w:rPr>
+        <w:t>Sungshin</w:t>
+      </w:r>
+      <w:proofErr w:type="spellEnd"/>
+      <w:r>
+        <w:rPr>
+          <w:rFonts w:ascii="Calibri Light" w:hAnsi="Calibri Light" w:cs="Calibri Light"/>
+          <w:i/>
+          <w:iCs/>
+          <w:sz w:val="20"/>
+          <w:szCs w:val="20"/>
+        </w:rPr>
+        <w:t xml:space="preserve"> Kim</w:t>
       </w:r>
     </w:p>
     <w:p>
@@ -4366,6 +4666,7 @@
         </w:rPr>
         <w:t xml:space="preserve">Stan, </w:t>
       </w:r>
+      <w:proofErr w:type="spellStart"/>
       <w:r>
         <w:rPr>
           <w:rFonts w:ascii="Calibri Light" w:hAnsi="Calibri Light" w:cs="Calibri Light"/>
@@ -4382,6 +4683,7 @@
         </w:rPr>
         <w:t>atlab</w:t>
       </w:r>
+      <w:proofErr w:type="spellEnd"/>
     </w:p>
     <w:p>
       <w:pPr>
@@ -4474,6 +4776,7 @@
         </w:rPr>
         <w:t xml:space="preserve"> SPM, </w:t>
       </w:r>
+      <w:proofErr w:type="spellStart"/>
       <w:r>
         <w:rPr>
           <w:rFonts w:ascii="Calibri Light" w:hAnsi="Calibri Light" w:cs="Calibri Light"/>
@@ -4488,7 +4791,16 @@
           <w:sz w:val="22"/>
           <w:szCs w:val="22"/>
         </w:rPr>
-        <w:t xml:space="preserve">ilearn </w:t>
+        <w:t>ilearn</w:t>
+      </w:r>
+      <w:proofErr w:type="spellEnd"/>
+      <w:r>
+        <w:rPr>
+          <w:rFonts w:ascii="Calibri Light" w:hAnsi="Calibri Light" w:cs="Calibri Light"/>
+          <w:sz w:val="22"/>
+          <w:szCs w:val="22"/>
+        </w:rPr>
+        <w:t xml:space="preserve"> </w:t>
       </w:r>
     </w:p>
     <w:p>
@@ -4598,8 +4910,20 @@
           <w:sz w:val="22"/>
           <w:szCs w:val="22"/>
         </w:rPr>
-        <w:t>Professor Woo-Young Ahn</w:t>
-      </w:r>
+        <w:t xml:space="preserve">Professor Woo-Young </w:t>
+      </w:r>
+      <w:proofErr w:type="spellStart"/>
+      <w:r>
+        <w:rPr>
+          <w:rFonts w:ascii="Calibri Light" w:hAnsi="Calibri Light" w:cs="Calibri Light"/>
+          <w:b/>
+          <w:bCs/>
+          <w:sz w:val="22"/>
+          <w:szCs w:val="22"/>
+        </w:rPr>
+        <w:t>Ahn</w:t>
+      </w:r>
+      <w:proofErr w:type="spellEnd"/>
     </w:p>
     <w:p>
       <w:pPr>

</xml_diff>

<commit_message>
edit CV, proofread posts
</commit_message>
<xml_diff>
--- a/assets/CV_minakwon.docx
+++ b/assets/CV_minakwon.docx
@@ -1248,7 +1248,23 @@
           <w:sz w:val="22"/>
           <w:lang w:eastAsia="ko-KR"/>
         </w:rPr>
-        <w:t xml:space="preserve">, W.-Y. (under review) </w:t>
+        <w:t>, W.-Y. (</w:t>
+      </w:r>
+      <w:r>
+        <w:rPr>
+          <w:rFonts w:ascii="Calibri Light" w:hAnsi="Calibri Light" w:cs="Calibri Light"/>
+          <w:sz w:val="22"/>
+          <w:lang w:eastAsia="ko-KR"/>
+        </w:rPr>
+        <w:t>revised and resubmitted</w:t>
+      </w:r>
+      <w:r>
+        <w:rPr>
+          <w:rFonts w:ascii="Calibri Light" w:hAnsi="Calibri Light" w:cs="Calibri Light"/>
+          <w:sz w:val="22"/>
+          <w:lang w:eastAsia="ko-KR"/>
+        </w:rPr>
+        <w:t xml:space="preserve">) </w:t>
       </w:r>
       <w:r>
         <w:rPr>
@@ -1739,15 +1755,7 @@
           <w:sz w:val="22"/>
           <w:lang w:eastAsia="ko-KR"/>
         </w:rPr>
-        <w:t>202</w:t>
-      </w:r>
-      <w:r>
-        <w:rPr>
-          <w:rFonts w:ascii="Calibri Light" w:hAnsi="Calibri Light" w:cs="Calibri Light"/>
-          <w:sz w:val="22"/>
-          <w:lang w:eastAsia="ko-KR"/>
-        </w:rPr>
-        <w:t>3</w:t>
+        <w:t>2023</w:t>
       </w:r>
       <w:r>
         <w:rPr>

</xml_diff>